<commit_message>
Added github link in word
</commit_message>
<xml_diff>
--- a/Assingment_2.docx
+++ b/Assingment_2.docx
@@ -61,6 +61,107 @@
         <w:tab/>
         <w:t>Nirav Saxena (8979968)</w:t>
       </w:r>
+    </w:p>
+    <w:p>
+      <w:pPr>
+        <w:rPr>
+          <w:rFonts w:asciiTheme="majorHAnsi" w:eastAsiaTheme="majorEastAsia" w:hAnsiTheme="majorHAnsi" w:cstheme="majorBidi"/>
+          <w:color w:val="0F4761" w:themeColor="accent1" w:themeShade="BF"/>
+          <w:sz w:val="32"/>
+          <w:szCs w:val="32"/>
+        </w:rPr>
+      </w:pPr>
+    </w:p>
+    <w:p>
+      <w:pPr>
+        <w:rPr>
+          <w:rFonts w:asciiTheme="majorHAnsi" w:eastAsiaTheme="majorEastAsia" w:hAnsiTheme="majorHAnsi" w:cstheme="majorBidi"/>
+          <w:color w:val="0F4761" w:themeColor="accent1" w:themeShade="BF"/>
+          <w:sz w:val="32"/>
+          <w:szCs w:val="32"/>
+        </w:rPr>
+      </w:pPr>
+      <w:r>
+        <w:rPr>
+          <w:rFonts w:asciiTheme="majorHAnsi" w:eastAsiaTheme="majorEastAsia" w:hAnsiTheme="majorHAnsi" w:cstheme="majorBidi"/>
+          <w:color w:val="0F4761" w:themeColor="accent1" w:themeShade="BF"/>
+          <w:sz w:val="32"/>
+          <w:szCs w:val="32"/>
+        </w:rPr>
+        <w:t xml:space="preserve">CarRental_Lab4_NS - </w:t>
+      </w:r>
+      <w:hyperlink r:id="rId7" w:history="1">
+        <w:r>
+          <w:rPr>
+            <w:rStyle w:val="Hyperlink"/>
+            <w:rFonts w:asciiTheme="majorHAnsi" w:eastAsiaTheme="majorEastAsia" w:hAnsiTheme="majorHAnsi" w:cstheme="majorBidi"/>
+            <w:sz w:val="32"/>
+            <w:szCs w:val="32"/>
+          </w:rPr>
+          <w:t>https://github.com/Nirav04-hub/CarRental_Lab4_NS.git</w:t>
+        </w:r>
+      </w:hyperlink>
+      <w:r>
+        <w:rPr>
+          <w:rFonts w:asciiTheme="majorHAnsi" w:eastAsiaTheme="majorEastAsia" w:hAnsiTheme="majorHAnsi" w:cstheme="majorBidi"/>
+          <w:color w:val="0F4761" w:themeColor="accent1" w:themeShade="BF"/>
+          <w:sz w:val="32"/>
+          <w:szCs w:val="32"/>
+        </w:rPr>
+        <w:br/>
+        <w:t xml:space="preserve">VehicleInventory_Assignment1- </w:t>
+      </w:r>
+      <w:hyperlink r:id="rId8" w:history="1">
+        <w:r>
+          <w:rPr>
+            <w:rStyle w:val="Hyperlink"/>
+            <w:rFonts w:asciiTheme="majorHAnsi" w:eastAsiaTheme="majorEastAsia" w:hAnsiTheme="majorHAnsi" w:cstheme="majorBidi"/>
+            <w:sz w:val="32"/>
+            <w:szCs w:val="32"/>
+          </w:rPr>
+          <w:t>https://github.com/Nirav04-hub/VehicaleInventroy_Assignment1_NS.git</w:t>
+        </w:r>
+      </w:hyperlink>
+    </w:p>
+    <w:p>
+      <w:pPr>
+        <w:rPr>
+          <w:rFonts w:asciiTheme="majorHAnsi" w:eastAsiaTheme="majorEastAsia" w:hAnsiTheme="majorHAnsi" w:cstheme="majorBidi"/>
+          <w:color w:val="0F4761" w:themeColor="accent1" w:themeShade="BF"/>
+          <w:sz w:val="32"/>
+          <w:szCs w:val="32"/>
+        </w:rPr>
+      </w:pPr>
+    </w:p>
+    <w:p>
+      <w:pPr>
+        <w:rPr>
+          <w:rFonts w:asciiTheme="majorHAnsi" w:eastAsiaTheme="majorEastAsia" w:hAnsiTheme="majorHAnsi" w:cstheme="majorBidi"/>
+          <w:color w:val="0F4761" w:themeColor="accent1" w:themeShade="BF"/>
+          <w:sz w:val="32"/>
+          <w:szCs w:val="32"/>
+        </w:rPr>
+      </w:pPr>
+    </w:p>
+    <w:p>
+      <w:pPr>
+        <w:rPr>
+          <w:rFonts w:asciiTheme="majorHAnsi" w:eastAsiaTheme="majorEastAsia" w:hAnsiTheme="majorHAnsi" w:cstheme="majorBidi"/>
+          <w:color w:val="0F4761" w:themeColor="accent1" w:themeShade="BF"/>
+          <w:sz w:val="32"/>
+          <w:szCs w:val="32"/>
+        </w:rPr>
+      </w:pPr>
+    </w:p>
+    <w:p>
+      <w:pPr>
+        <w:rPr>
+          <w:rFonts w:asciiTheme="majorHAnsi" w:eastAsiaTheme="majorEastAsia" w:hAnsiTheme="majorHAnsi" w:cstheme="majorBidi"/>
+          <w:color w:val="0F4761" w:themeColor="accent1" w:themeShade="BF"/>
+          <w:sz w:val="32"/>
+          <w:szCs w:val="32"/>
+        </w:rPr>
+      </w:pPr>
     </w:p>
     <w:p>
       <w:pPr>
@@ -154,33 +255,6 @@
       <w:r>
         <w:br/>
       </w:r>
-      <w:r>
-        <w:br/>
-      </w:r>
-      <w:r>
-        <w:br/>
-      </w:r>
-      <w:r>
-        <w:br/>
-      </w:r>
-      <w:r>
-        <w:br/>
-      </w:r>
-      <w:r>
-        <w:br/>
-      </w:r>
-      <w:r>
-        <w:br/>
-      </w:r>
-      <w:r>
-        <w:br/>
-      </w:r>
-      <w:r>
-        <w:br/>
-      </w:r>
-      <w:r>
-        <w:br/>
-      </w:r>
     </w:p>
     <w:p>
       <w:pPr>
@@ -197,16 +271,13 @@
         </w:rPr>
       </w:pPr>
       <w:r>
-        <w:br/>
-      </w:r>
-      <w:r>
-        <w:br/>
-      </w:r>
-      <w:r>
         <w:lastRenderedPageBreak/>
         <w:br/>
       </w:r>
       <w:r>
+        <w:br/>
+      </w:r>
+      <w:r>
         <w:tab/>
       </w:r>
       <w:r>
@@ -230,6 +301,7 @@
       <w:r>
         <w:rPr>
           <w:rStyle w:val="Heading1Char"/>
+          <w:noProof/>
         </w:rPr>
         <w:drawing>
           <wp:anchor distT="0" distB="0" distL="114300" distR="114300" simplePos="0" relativeHeight="251659264" behindDoc="1" locked="0" layoutInCell="1" allowOverlap="1" wp14:anchorId="2A968B22" wp14:editId="4193071B">
@@ -263,7 +335,7 @@
                     <pic:cNvPicPr/>
                   </pic:nvPicPr>
                   <pic:blipFill>
-                    <a:blip r:embed="rId7">
+                    <a:blip r:embed="rId9">
                       <a:extLst>
                         <a:ext uri="{28A0092B-C50C-407E-A947-70E740481C1C}">
                           <a14:useLocalDpi xmlns:a14="http://schemas.microsoft.com/office/drawing/2010/main" val="0"/>
@@ -355,6 +427,7 @@
       <w:r>
         <w:rPr>
           <w:rStyle w:val="Heading2Char"/>
+          <w:noProof/>
         </w:rPr>
         <w:lastRenderedPageBreak/>
         <w:drawing>
@@ -389,7 +462,7 @@
                     <pic:cNvPicPr/>
                   </pic:nvPicPr>
                   <pic:blipFill>
-                    <a:blip r:embed="rId8">
+                    <a:blip r:embed="rId10">
                       <a:extLst>
                         <a:ext uri="{28A0092B-C50C-407E-A947-70E740481C1C}">
                           <a14:useLocalDpi xmlns:a14="http://schemas.microsoft.com/office/drawing/2010/main" val="0"/>
@@ -479,12 +552,12 @@
       </w:r>
       <w:proofErr w:type="spellEnd"/>
       <w:r>
-        <w:t>. All calls to the backend pass via this client that will automatically add the API key header:</w:t>
-      </w:r>
-      <w:r>
-        <w:t xml:space="preserve"> </w:t>
-      </w:r>
-      <w:r>
+        <w:t xml:space="preserve">. All calls to the backend pass via this client that will automatically add the API key header: </w:t>
+      </w:r>
+      <w:r>
+        <w:rPr>
+          <w:noProof/>
+        </w:rPr>
         <w:drawing>
           <wp:inline distT="0" distB="0" distL="0" distR="0" wp14:anchorId="19E4D85C" wp14:editId="369D95A6">
             <wp:extent cx="9105900" cy="5120074"/>
@@ -501,7 +574,7 @@
                     <pic:cNvPicPr/>
                   </pic:nvPicPr>
                   <pic:blipFill>
-                    <a:blip r:embed="rId9"/>
+                    <a:blip r:embed="rId11"/>
                     <a:stretch>
                       <a:fillRect/>
                     </a:stretch>
@@ -524,6 +597,9 @@
     </w:p>
     <w:p>
       <w:r>
+        <w:rPr>
+          <w:noProof/>
+        </w:rPr>
         <w:lastRenderedPageBreak/>
         <w:drawing>
           <wp:inline distT="0" distB="0" distL="0" distR="0" wp14:anchorId="3DF7E773" wp14:editId="28C9BD01">
@@ -541,7 +617,7 @@
                     <pic:cNvPicPr/>
                   </pic:nvPicPr>
                   <pic:blipFill>
-                    <a:blip r:embed="rId10"/>
+                    <a:blip r:embed="rId12"/>
                     <a:stretch>
                       <a:fillRect/>
                     </a:stretch>
@@ -584,6 +660,9 @@
     </w:p>
     <w:p>
       <w:r>
+        <w:rPr>
+          <w:noProof/>
+        </w:rPr>
         <w:drawing>
           <wp:anchor distT="0" distB="0" distL="114300" distR="114300" simplePos="0" relativeHeight="251661312" behindDoc="1" locked="0" layoutInCell="1" allowOverlap="1" wp14:anchorId="211FE302" wp14:editId="0E64C933">
             <wp:simplePos x="0" y="0"/>
@@ -616,7 +695,7 @@
                     <pic:cNvPicPr/>
                   </pic:nvPicPr>
                   <pic:blipFill>
-                    <a:blip r:embed="rId11">
+                    <a:blip r:embed="rId13">
                       <a:extLst>
                         <a:ext uri="{28A0092B-C50C-407E-A947-70E740481C1C}">
                           <a14:useLocalDpi xmlns:a14="http://schemas.microsoft.com/office/drawing/2010/main" val="0"/>
@@ -686,7 +765,7 @@
         <w:br/>
         <w:t xml:space="preserve">The gateway is running on </w:t>
       </w:r>
-      <w:hyperlink r:id="rId12" w:history="1">
+      <w:hyperlink r:id="rId14" w:history="1">
         <w:r>
           <w:rPr>
             <w:rStyle w:val="Hyperlink"/>
@@ -715,6 +794,9 @@
         </w:numPr>
       </w:pPr>
       <w:r>
+        <w:rPr>
+          <w:noProof/>
+        </w:rPr>
         <w:lastRenderedPageBreak/>
         <w:drawing>
           <wp:anchor distT="0" distB="0" distL="114300" distR="114300" simplePos="0" relativeHeight="251662336" behindDoc="1" locked="0" layoutInCell="1" allowOverlap="1" wp14:anchorId="3816D8CB" wp14:editId="355D03CB">
@@ -748,7 +830,7 @@
                     <pic:cNvPicPr/>
                   </pic:nvPicPr>
                   <pic:blipFill>
-                    <a:blip r:embed="rId13">
+                    <a:blip r:embed="rId15">
                       <a:extLst>
                         <a:ext uri="{28A0092B-C50C-407E-A947-70E740481C1C}">
                           <a14:useLocalDpi xmlns:a14="http://schemas.microsoft.com/office/drawing/2010/main" val="0"/>
@@ -790,6 +872,9 @@
         </w:numPr>
       </w:pPr>
       <w:r>
+        <w:rPr>
+          <w:noProof/>
+        </w:rPr>
         <w:lastRenderedPageBreak/>
         <w:drawing>
           <wp:anchor distT="0" distB="0" distL="114300" distR="114300" simplePos="0" relativeHeight="251663360" behindDoc="0" locked="0" layoutInCell="1" allowOverlap="1" wp14:anchorId="4CB60FB0" wp14:editId="0311EB5D">
@@ -815,7 +900,7 @@
                     <pic:cNvPicPr/>
                   </pic:nvPicPr>
                   <pic:blipFill>
-                    <a:blip r:embed="rId14">
+                    <a:blip r:embed="rId16">
                       <a:extLst>
                         <a:ext uri="{28A0092B-C50C-407E-A947-70E740481C1C}">
                           <a14:useLocalDpi xmlns:a14="http://schemas.microsoft.com/office/drawing/2010/main" val="0"/>
@@ -876,6 +961,9 @@
         </w:numPr>
       </w:pPr>
       <w:r>
+        <w:rPr>
+          <w:noProof/>
+        </w:rPr>
         <w:lastRenderedPageBreak/>
         <w:drawing>
           <wp:anchor distT="0" distB="0" distL="114300" distR="114300" simplePos="0" relativeHeight="251664384" behindDoc="0" locked="0" layoutInCell="1" allowOverlap="1" wp14:anchorId="7DFFA764" wp14:editId="3FC9320E">
@@ -901,7 +989,7 @@
                     <pic:cNvPicPr/>
                   </pic:nvPicPr>
                   <pic:blipFill>
-                    <a:blip r:embed="rId15">
+                    <a:blip r:embed="rId17">
                       <a:extLst>
                         <a:ext uri="{28A0092B-C50C-407E-A947-70E740481C1C}">
                           <a14:useLocalDpi xmlns:a14="http://schemas.microsoft.com/office/drawing/2010/main" val="0"/>
@@ -943,16 +1031,7 @@
       </w:r>
       <w:proofErr w:type="spellStart"/>
       <w:r>
-        <w:t>A</w:t>
-      </w:r>
-      <w:r>
-        <w:t>pi</w:t>
-      </w:r>
-      <w:r>
-        <w:t>key</w:t>
-      </w:r>
-      <w:r>
-        <w:t>AuthMiddleware</w:t>
+        <w:t>ApikeyAuthMiddleware</w:t>
       </w:r>
       <w:proofErr w:type="spellEnd"/>
       <w:r>
@@ -969,6 +1048,9 @@
         </w:numPr>
       </w:pPr>
       <w:r>
+        <w:rPr>
+          <w:noProof/>
+        </w:rPr>
         <w:lastRenderedPageBreak/>
         <w:drawing>
           <wp:anchor distT="0" distB="0" distL="114300" distR="114300" simplePos="0" relativeHeight="251665408" behindDoc="0" locked="0" layoutInCell="1" allowOverlap="1" wp14:anchorId="682F343B" wp14:editId="6C5F88C3">
@@ -994,7 +1076,7 @@
                     <pic:cNvPicPr/>
                   </pic:nvPicPr>
                   <pic:blipFill>
-                    <a:blip r:embed="rId16">
+                    <a:blip r:embed="rId18">
                       <a:extLst>
                         <a:ext uri="{28A0092B-C50C-407E-A947-70E740481C1C}">
                           <a14:useLocalDpi xmlns:a14="http://schemas.microsoft.com/office/drawing/2010/main" val="0"/>
@@ -1063,6 +1145,9 @@
         </w:numPr>
       </w:pPr>
       <w:r>
+        <w:rPr>
+          <w:noProof/>
+        </w:rPr>
         <w:lastRenderedPageBreak/>
         <w:drawing>
           <wp:anchor distT="0" distB="0" distL="114300" distR="114300" simplePos="0" relativeHeight="251666432" behindDoc="0" locked="0" layoutInCell="1" allowOverlap="1" wp14:anchorId="58E017C9" wp14:editId="09504614">
@@ -1088,7 +1173,7 @@
                     <pic:cNvPicPr/>
                   </pic:nvPicPr>
                   <pic:blipFill>
-                    <a:blip r:embed="rId17">
+                    <a:blip r:embed="rId19">
                       <a:extLst>
                         <a:ext uri="{28A0092B-C50C-407E-A947-70E740481C1C}">
                           <a14:useLocalDpi xmlns:a14="http://schemas.microsoft.com/office/drawing/2010/main" val="0"/>
@@ -1154,9 +1239,12 @@
         </w:numPr>
       </w:pPr>
       <w:r>
+        <w:rPr>
+          <w:noProof/>
+        </w:rPr>
         <w:lastRenderedPageBreak/>
         <w:drawing>
-          <wp:anchor distT="0" distB="0" distL="114300" distR="114300" simplePos="0" relativeHeight="251667456" behindDoc="0" locked="0" layoutInCell="1" allowOverlap="1" wp14:anchorId="4DB6093F" wp14:editId="7D33FEE2">
+          <wp:anchor distT="0" distB="0" distL="114300" distR="114300" simplePos="0" relativeHeight="251667456" behindDoc="0" locked="0" layoutInCell="1" allowOverlap="1" wp14:anchorId="4DB6093F" wp14:editId="61F8C349">
             <wp:simplePos x="0" y="0"/>
             <wp:positionH relativeFrom="column">
               <wp:posOffset>381000</wp:posOffset>
@@ -1179,7 +1267,7 @@
                     <pic:cNvPicPr/>
                   </pic:nvPicPr>
                   <pic:blipFill>
-                    <a:blip r:embed="rId18" cstate="print">
+                    <a:blip r:embed="rId20" cstate="print">
                       <a:extLst>
                         <a:ext uri="{28A0092B-C50C-407E-A947-70E740481C1C}">
                           <a14:useLocalDpi xmlns:a14="http://schemas.microsoft.com/office/drawing/2010/main" val="0"/>
@@ -1301,6 +1389,9 @@
         </w:numPr>
       </w:pPr>
       <w:r>
+        <w:rPr>
+          <w:noProof/>
+        </w:rPr>
         <w:lastRenderedPageBreak/>
         <w:drawing>
           <wp:anchor distT="0" distB="0" distL="114300" distR="114300" simplePos="0" relativeHeight="251668480" behindDoc="1" locked="0" layoutInCell="1" allowOverlap="1" wp14:anchorId="1074B3EA" wp14:editId="0F944FA4">
@@ -1334,7 +1425,7 @@
                     <pic:cNvPicPr/>
                   </pic:nvPicPr>
                   <pic:blipFill>
-                    <a:blip r:embed="rId19">
+                    <a:blip r:embed="rId21">
                       <a:extLst>
                         <a:ext uri="{28A0092B-C50C-407E-A947-70E740481C1C}">
                           <a14:useLocalDpi xmlns:a14="http://schemas.microsoft.com/office/drawing/2010/main" val="0"/>
@@ -1387,14 +1478,7 @@
           <w:b/>
           <w:bCs/>
         </w:rPr>
-        <w:t xml:space="preserve"> must be greater than zero</w:t>
-      </w:r>
-      <w:r>
-        <w:rPr>
-          <w:b/>
-          <w:bCs/>
-        </w:rPr>
-        <w:t xml:space="preserve"> </w:t>
+        <w:t xml:space="preserve"> must be greater than zero </w:t>
       </w:r>
       <w:r>
         <w:rPr>
@@ -1452,6 +1536,9 @@
         </w:numPr>
       </w:pPr>
       <w:r>
+        <w:rPr>
+          <w:noProof/>
+        </w:rPr>
         <w:lastRenderedPageBreak/>
         <w:drawing>
           <wp:anchor distT="0" distB="0" distL="114300" distR="114300" simplePos="0" relativeHeight="251669504" behindDoc="0" locked="0" layoutInCell="1" allowOverlap="1" wp14:anchorId="11DC9C1B" wp14:editId="34FC3799">
@@ -1477,7 +1564,7 @@
                     <pic:cNvPicPr/>
                   </pic:nvPicPr>
                   <pic:blipFill>
-                    <a:blip r:embed="rId20">
+                    <a:blip r:embed="rId22">
                       <a:extLst>
                         <a:ext uri="{28A0092B-C50C-407E-A947-70E740481C1C}">
                           <a14:useLocalDpi xmlns:a14="http://schemas.microsoft.com/office/drawing/2010/main" val="0"/>
@@ -1610,6 +1697,7 @@
         <w:rPr>
           <w:b/>
           <w:bCs/>
+          <w:noProof/>
         </w:rPr>
         <w:drawing>
           <wp:anchor distT="0" distB="0" distL="114300" distR="114300" simplePos="0" relativeHeight="251670528" behindDoc="1" locked="0" layoutInCell="1" allowOverlap="1" wp14:anchorId="5B01F9D3" wp14:editId="3B8A8094">
@@ -1635,7 +1723,7 @@
                     <pic:cNvPicPr/>
                   </pic:nvPicPr>
                   <pic:blipFill>
-                    <a:blip r:embed="rId21" cstate="print">
+                    <a:blip r:embed="rId23" cstate="print">
                       <a:extLst>
                         <a:ext uri="{28A0092B-C50C-407E-A947-70E740481C1C}">
                           <a14:useLocalDpi xmlns:a14="http://schemas.microsoft.com/office/drawing/2010/main" val="0"/>
@@ -1672,14 +1760,7 @@
           <w:b/>
           <w:bCs/>
         </w:rPr>
-        <w:t>Value Object</w:t>
-      </w:r>
-      <w:r>
-        <w:rPr>
-          <w:b/>
-          <w:bCs/>
-        </w:rPr>
-        <w:t xml:space="preserve"> –</w:t>
+        <w:t>Value Object –</w:t>
       </w:r>
       <w:r>
         <w:rPr>
@@ -1730,6 +1811,7 @@
         <w:rPr>
           <w:b/>
           <w:bCs/>
+          <w:noProof/>
         </w:rPr>
         <w:lastRenderedPageBreak/>
         <w:drawing>
@@ -1764,7 +1846,7 @@
                     <pic:cNvPicPr/>
                   </pic:nvPicPr>
                   <pic:blipFill>
-                    <a:blip r:embed="rId22">
+                    <a:blip r:embed="rId24">
                       <a:extLst>
                         <a:ext uri="{28A0092B-C50C-407E-A947-70E740481C1C}">
                           <a14:useLocalDpi xmlns:a14="http://schemas.microsoft.com/office/drawing/2010/main" val="0"/>
@@ -2038,6 +2120,7 @@
         <w:rPr>
           <w:b/>
           <w:bCs/>
+          <w:noProof/>
         </w:rPr>
         <w:drawing>
           <wp:inline distT="0" distB="0" distL="0" distR="0" wp14:anchorId="145766CE" wp14:editId="022FDB97">
@@ -2055,7 +2138,7 @@
                     <pic:cNvPicPr/>
                   </pic:nvPicPr>
                   <pic:blipFill>
-                    <a:blip r:embed="rId23"/>
+                    <a:blip r:embed="rId25"/>
                     <a:stretch>
                       <a:fillRect/>
                     </a:stretch>
@@ -2107,6 +2190,7 @@
         <w:rPr>
           <w:b/>
           <w:bCs/>
+          <w:noProof/>
         </w:rPr>
         <w:lastRenderedPageBreak/>
         <w:drawing>
@@ -2125,7 +2209,7 @@
                     <pic:cNvPicPr/>
                   </pic:nvPicPr>
                   <pic:blipFill>
-                    <a:blip r:embed="rId24"/>
+                    <a:blip r:embed="rId26"/>
                     <a:stretch>
                       <a:fillRect/>
                     </a:stretch>
@@ -2183,6 +2267,9 @@
         </w:numPr>
       </w:pPr>
       <w:r>
+        <w:rPr>
+          <w:noProof/>
+        </w:rPr>
         <w:drawing>
           <wp:anchor distT="0" distB="0" distL="114300" distR="114300" simplePos="0" relativeHeight="251672576" behindDoc="0" locked="0" layoutInCell="1" allowOverlap="1" wp14:anchorId="7E1289C7" wp14:editId="3C73FE11">
             <wp:simplePos x="0" y="0"/>
@@ -2207,7 +2294,7 @@
                     <pic:cNvPicPr/>
                   </pic:nvPicPr>
                   <pic:blipFill>
-                    <a:blip r:embed="rId25">
+                    <a:blip r:embed="rId27">
                       <a:extLst>
                         <a:ext uri="{28A0092B-C50C-407E-A947-70E740481C1C}">
                           <a14:useLocalDpi xmlns:a14="http://schemas.microsoft.com/office/drawing/2010/main" val="0"/>
@@ -2249,6 +2336,9 @@
         </w:numPr>
       </w:pPr>
       <w:r>
+        <w:rPr>
+          <w:noProof/>
+        </w:rPr>
         <w:lastRenderedPageBreak/>
         <w:drawing>
           <wp:anchor distT="0" distB="0" distL="114300" distR="114300" simplePos="0" relativeHeight="251673600" behindDoc="0" locked="0" layoutInCell="1" allowOverlap="1" wp14:anchorId="4AA87CC3" wp14:editId="57A10D35">
@@ -2274,7 +2364,7 @@
                     <pic:cNvPicPr/>
                   </pic:nvPicPr>
                   <pic:blipFill>
-                    <a:blip r:embed="rId26">
+                    <a:blip r:embed="rId28">
                       <a:extLst>
                         <a:ext uri="{28A0092B-C50C-407E-A947-70E740481C1C}">
                           <a14:useLocalDpi xmlns:a14="http://schemas.microsoft.com/office/drawing/2010/main" val="0"/>
@@ -2349,6 +2439,9 @@
         </w:numPr>
       </w:pPr>
       <w:r>
+        <w:rPr>
+          <w:noProof/>
+        </w:rPr>
         <w:lastRenderedPageBreak/>
         <w:drawing>
           <wp:anchor distT="0" distB="0" distL="114300" distR="114300" simplePos="0" relativeHeight="251674624" behindDoc="1" locked="0" layoutInCell="1" allowOverlap="1" wp14:anchorId="4236FB80" wp14:editId="3DA71DA9">
@@ -2382,7 +2475,7 @@
                     <pic:cNvPicPr/>
                   </pic:nvPicPr>
                   <pic:blipFill>
-                    <a:blip r:embed="rId27">
+                    <a:blip r:embed="rId29">
                       <a:extLst>
                         <a:ext uri="{28A0092B-C50C-407E-A947-70E740481C1C}">
                           <a14:useLocalDpi xmlns:a14="http://schemas.microsoft.com/office/drawing/2010/main" val="0"/>
@@ -2469,6 +2562,9 @@
         </w:numPr>
       </w:pPr>
       <w:r>
+        <w:rPr>
+          <w:noProof/>
+        </w:rPr>
         <w:lastRenderedPageBreak/>
         <w:drawing>
           <wp:anchor distT="0" distB="0" distL="114300" distR="114300" simplePos="0" relativeHeight="251675648" behindDoc="0" locked="0" layoutInCell="1" allowOverlap="1" wp14:anchorId="3DFE5A1E" wp14:editId="10B29B02">
@@ -2491,229 +2587,6 @@
                 <pic:pic xmlns:pic="http://schemas.openxmlformats.org/drawingml/2006/picture">
                   <pic:nvPicPr>
                     <pic:cNvPr id="1531052379" name=""/>
-                    <pic:cNvPicPr/>
-                  </pic:nvPicPr>
-                  <pic:blipFill>
-                    <a:blip r:embed="rId28">
-                      <a:extLst>
-                        <a:ext uri="{28A0092B-C50C-407E-A947-70E740481C1C}">
-                          <a14:useLocalDpi xmlns:a14="http://schemas.microsoft.com/office/drawing/2010/main" val="0"/>
-                        </a:ext>
-                      </a:extLst>
-                    </a:blip>
-                    <a:stretch>
-                      <a:fillRect/>
-                    </a:stretch>
-                  </pic:blipFill>
-                  <pic:spPr>
-                    <a:xfrm>
-                      <a:off x="0" y="0"/>
-                      <a:ext cx="9777730" cy="5497830"/>
-                    </a:xfrm>
-                    <a:prstGeom prst="rect">
-                      <a:avLst/>
-                    </a:prstGeom>
-                  </pic:spPr>
-                </pic:pic>
-              </a:graphicData>
-            </a:graphic>
-          </wp:anchor>
-        </w:drawing>
-      </w:r>
-      <w:r>
-        <w:rPr>
-          <w:b/>
-          <w:bCs/>
-        </w:rPr>
-        <w:t>Domain rule — rented vehicle cannot be reserved</w:t>
-      </w:r>
-      <w:r>
-        <w:rPr>
-          <w:b/>
-          <w:bCs/>
-        </w:rPr>
-        <w:t xml:space="preserve">: </w:t>
-      </w:r>
-      <w:r>
-        <w:t xml:space="preserve">This test confirms that the aggregate root Vehicle is business rule compliant. The vehicle is initially changed to </w:t>
-      </w:r>
-      <w:proofErr w:type="spellStart"/>
-      <w:r>
-        <w:t>Rentedand</w:t>
-      </w:r>
-      <w:proofErr w:type="spellEnd"/>
-      <w:r>
-        <w:t xml:space="preserve"> then to Reserved</w:t>
-      </w:r>
-      <w:r>
-        <w:t xml:space="preserve">. </w:t>
-      </w:r>
-      <w:proofErr w:type="spellStart"/>
-      <w:r>
-        <w:t>MarkReserved</w:t>
-      </w:r>
-      <w:proofErr w:type="spellEnd"/>
-      <w:r>
-        <w:t xml:space="preserve">() of the Vehicle entity is a </w:t>
-      </w:r>
-      <w:proofErr w:type="spellStart"/>
-      <w:r>
-        <w:t>DomainException</w:t>
-      </w:r>
-      <w:proofErr w:type="spellEnd"/>
-      <w:r>
-        <w:t>. It is caught by the controller and sent back (400).</w:t>
-      </w:r>
-      <w:r>
-        <w:br/>
-      </w:r>
-    </w:p>
-    <w:p>
-      <w:pPr>
-        <w:pStyle w:val="Heading2"/>
-        <w:numPr>
-          <w:ilvl w:val="0"/>
-          <w:numId w:val="7"/>
-        </w:numPr>
-        <w:rPr>
-          <w:b/>
-          <w:bCs/>
-        </w:rPr>
-      </w:pPr>
-      <w:r>
-        <w:rPr>
-          <w:b/>
-          <w:bCs/>
-        </w:rPr>
-        <w:lastRenderedPageBreak/>
-        <w:drawing>
-          <wp:anchor distT="0" distB="0" distL="114300" distR="114300" simplePos="0" relativeHeight="251676672" behindDoc="0" locked="0" layoutInCell="1" allowOverlap="1" wp14:anchorId="3897A6B5" wp14:editId="08DBA12D">
-            <wp:simplePos x="0" y="0"/>
-            <wp:positionH relativeFrom="column">
-              <wp:posOffset>104775</wp:posOffset>
-            </wp:positionH>
-            <wp:positionV relativeFrom="paragraph">
-              <wp:posOffset>333375</wp:posOffset>
-            </wp:positionV>
-            <wp:extent cx="9777730" cy="5500370"/>
-            <wp:effectExtent l="0" t="0" r="0" b="5080"/>
-            <wp:wrapSquare wrapText="bothSides"/>
-            <wp:docPr id="757184896" name="Picture 1"/>
-            <wp:cNvGraphicFramePr>
-              <a:graphicFrameLocks xmlns:a="http://schemas.openxmlformats.org/drawingml/2006/main" noChangeAspect="1"/>
-            </wp:cNvGraphicFramePr>
-            <a:graphic xmlns:a="http://schemas.openxmlformats.org/drawingml/2006/main">
-              <a:graphicData uri="http://schemas.openxmlformats.org/drawingml/2006/picture">
-                <pic:pic xmlns:pic="http://schemas.openxmlformats.org/drawingml/2006/picture">
-                  <pic:nvPicPr>
-                    <pic:cNvPr id="757184896" name=""/>
-                    <pic:cNvPicPr/>
-                  </pic:nvPicPr>
-                  <pic:blipFill>
-                    <a:blip r:embed="rId29">
-                      <a:extLst>
-                        <a:ext uri="{28A0092B-C50C-407E-A947-70E740481C1C}">
-                          <a14:useLocalDpi xmlns:a14="http://schemas.microsoft.com/office/drawing/2010/main" val="0"/>
-                        </a:ext>
-                      </a:extLst>
-                    </a:blip>
-                    <a:stretch>
-                      <a:fillRect/>
-                    </a:stretch>
-                  </pic:blipFill>
-                  <pic:spPr>
-                    <a:xfrm>
-                      <a:off x="0" y="0"/>
-                      <a:ext cx="9777730" cy="5500370"/>
-                    </a:xfrm>
-                    <a:prstGeom prst="rect">
-                      <a:avLst/>
-                    </a:prstGeom>
-                  </pic:spPr>
-                </pic:pic>
-              </a:graphicData>
-            </a:graphic>
-          </wp:anchor>
-        </w:drawing>
-      </w:r>
-      <w:r>
-        <w:rPr>
-          <w:b/>
-          <w:bCs/>
-        </w:rPr>
-        <w:t>Deleting Vehicles</w:t>
-      </w:r>
-      <w:r>
-        <w:rPr>
-          <w:b/>
-          <w:bCs/>
-        </w:rPr>
-        <w:t xml:space="preserve">: This </w:t>
-      </w:r>
-      <w:proofErr w:type="gramStart"/>
-      <w:r>
-        <w:rPr>
-          <w:b/>
-          <w:bCs/>
-        </w:rPr>
-        <w:t>is shows</w:t>
-      </w:r>
-      <w:proofErr w:type="gramEnd"/>
-      <w:r>
-        <w:rPr>
-          <w:b/>
-          <w:bCs/>
-        </w:rPr>
-        <w:t xml:space="preserve"> that it is deleting the vehicle from table and showing success. </w:t>
-      </w:r>
-      <w:r>
-        <w:rPr>
-          <w:b/>
-          <w:bCs/>
-        </w:rPr>
-        <w:br/>
-      </w:r>
-    </w:p>
-    <w:p/>
-    <w:p>
-      <w:pPr>
-        <w:pStyle w:val="Heading2"/>
-        <w:numPr>
-          <w:ilvl w:val="0"/>
-          <w:numId w:val="7"/>
-        </w:numPr>
-        <w:rPr>
-          <w:b/>
-          <w:bCs/>
-        </w:rPr>
-      </w:pPr>
-      <w:r>
-        <w:rPr>
-          <w:b/>
-          <w:bCs/>
-        </w:rPr>
-        <w:lastRenderedPageBreak/>
-        <w:drawing>
-          <wp:anchor distT="0" distB="0" distL="114300" distR="114300" simplePos="0" relativeHeight="251677696" behindDoc="0" locked="0" layoutInCell="1" allowOverlap="1" wp14:anchorId="13BE4C34" wp14:editId="14FD10C6">
-            <wp:simplePos x="0" y="0"/>
-            <wp:positionH relativeFrom="column">
-              <wp:posOffset>85725</wp:posOffset>
-            </wp:positionH>
-            <wp:positionV relativeFrom="paragraph">
-              <wp:posOffset>495300</wp:posOffset>
-            </wp:positionV>
-            <wp:extent cx="9777730" cy="5497830"/>
-            <wp:effectExtent l="0" t="0" r="0" b="7620"/>
-            <wp:wrapSquare wrapText="bothSides"/>
-            <wp:docPr id="1974853776" name="Picture 1"/>
-            <wp:cNvGraphicFramePr>
-              <a:graphicFrameLocks xmlns:a="http://schemas.openxmlformats.org/drawingml/2006/main" noChangeAspect="1"/>
-            </wp:cNvGraphicFramePr>
-            <a:graphic xmlns:a="http://schemas.openxmlformats.org/drawingml/2006/main">
-              <a:graphicData uri="http://schemas.openxmlformats.org/drawingml/2006/picture">
-                <pic:pic xmlns:pic="http://schemas.openxmlformats.org/drawingml/2006/picture">
-                  <pic:nvPicPr>
-                    <pic:cNvPr id="1974853776" name=""/>
                     <pic:cNvPicPr/>
                   </pic:nvPicPr>
                   <pic:blipFill>
@@ -2748,63 +2621,49 @@
           <w:b/>
           <w:bCs/>
         </w:rPr>
-        <w:t>Updating the status: Updating the status of Vehicle From “</w:t>
-      </w:r>
-      <w:proofErr w:type="gramStart"/>
-      <w:r>
-        <w:rPr>
-          <w:b/>
-          <w:bCs/>
-        </w:rPr>
-        <w:t>Available ”</w:t>
-      </w:r>
-      <w:proofErr w:type="gramEnd"/>
-      <w:r>
-        <w:rPr>
-          <w:b/>
-          <w:bCs/>
-        </w:rPr>
-        <w:t xml:space="preserve"> to “Reserved” and </w:t>
-      </w:r>
-      <w:r>
-        <w:rPr>
-          <w:b/>
-          <w:bCs/>
-        </w:rPr>
-        <w:t xml:space="preserve">returns </w:t>
-      </w:r>
-      <w:r>
-        <w:rPr>
-          <w:b/>
-          <w:bCs/>
-        </w:rPr>
-        <w:t xml:space="preserve">200 </w:t>
-      </w:r>
-      <w:proofErr w:type="gramStart"/>
-      <w:r>
-        <w:rPr>
-          <w:b/>
-          <w:bCs/>
-        </w:rPr>
-        <w:t>ok</w:t>
-      </w:r>
-      <w:proofErr w:type="gramEnd"/>
-      <w:r>
-        <w:rPr>
-          <w:b/>
-          <w:bCs/>
-        </w:rPr>
-        <w:t xml:space="preserve"> </w:t>
-      </w:r>
-      <w:r>
-        <w:rPr>
-          <w:b/>
-          <w:bCs/>
-        </w:rPr>
+        <w:t>Domain rule — rented vehicle cannot be reserved</w:t>
+      </w:r>
+      <w:r>
+        <w:rPr>
+          <w:b/>
+          <w:bCs/>
+        </w:rPr>
+        <w:t xml:space="preserve">: </w:t>
+      </w:r>
+      <w:r>
+        <w:t xml:space="preserve">This test confirms that the aggregate root Vehicle is business rule compliant. The vehicle is initially changed to </w:t>
+      </w:r>
+      <w:proofErr w:type="spellStart"/>
+      <w:r>
+        <w:t>Rentedand</w:t>
+      </w:r>
+      <w:proofErr w:type="spellEnd"/>
+      <w:r>
+        <w:t xml:space="preserve"> then to Reserved</w:t>
+      </w:r>
+      <w:r>
+        <w:t xml:space="preserve">. </w:t>
+      </w:r>
+      <w:proofErr w:type="spellStart"/>
+      <w:r>
+        <w:t>MarkReserved</w:t>
+      </w:r>
+      <w:proofErr w:type="spellEnd"/>
+      <w:r>
+        <w:t xml:space="preserve">() of the Vehicle entity is a </w:t>
+      </w:r>
+      <w:proofErr w:type="spellStart"/>
+      <w:r>
+        <w:t>DomainException</w:t>
+      </w:r>
+      <w:proofErr w:type="spellEnd"/>
+      <w:r>
+        <w:t>. It is caught by the controller and sent back (400).</w:t>
+      </w:r>
+      <w:r>
         <w:br/>
       </w:r>
     </w:p>
-    <w:p/>
     <w:p>
       <w:pPr>
         <w:pStyle w:val="Heading2"/>
@@ -2821,6 +2680,246 @@
         <w:rPr>
           <w:b/>
           <w:bCs/>
+          <w:noProof/>
+        </w:rPr>
+        <w:lastRenderedPageBreak/>
+        <w:drawing>
+          <wp:anchor distT="0" distB="0" distL="114300" distR="114300" simplePos="0" relativeHeight="251676672" behindDoc="0" locked="0" layoutInCell="1" allowOverlap="1" wp14:anchorId="3897A6B5" wp14:editId="08DBA12D">
+            <wp:simplePos x="0" y="0"/>
+            <wp:positionH relativeFrom="column">
+              <wp:posOffset>104775</wp:posOffset>
+            </wp:positionH>
+            <wp:positionV relativeFrom="paragraph">
+              <wp:posOffset>333375</wp:posOffset>
+            </wp:positionV>
+            <wp:extent cx="9777730" cy="5500370"/>
+            <wp:effectExtent l="0" t="0" r="0" b="5080"/>
+            <wp:wrapSquare wrapText="bothSides"/>
+            <wp:docPr id="757184896" name="Picture 1"/>
+            <wp:cNvGraphicFramePr>
+              <a:graphicFrameLocks xmlns:a="http://schemas.openxmlformats.org/drawingml/2006/main" noChangeAspect="1"/>
+            </wp:cNvGraphicFramePr>
+            <a:graphic xmlns:a="http://schemas.openxmlformats.org/drawingml/2006/main">
+              <a:graphicData uri="http://schemas.openxmlformats.org/drawingml/2006/picture">
+                <pic:pic xmlns:pic="http://schemas.openxmlformats.org/drawingml/2006/picture">
+                  <pic:nvPicPr>
+                    <pic:cNvPr id="757184896" name=""/>
+                    <pic:cNvPicPr/>
+                  </pic:nvPicPr>
+                  <pic:blipFill>
+                    <a:blip r:embed="rId31">
+                      <a:extLst>
+                        <a:ext uri="{28A0092B-C50C-407E-A947-70E740481C1C}">
+                          <a14:useLocalDpi xmlns:a14="http://schemas.microsoft.com/office/drawing/2010/main" val="0"/>
+                        </a:ext>
+                      </a:extLst>
+                    </a:blip>
+                    <a:stretch>
+                      <a:fillRect/>
+                    </a:stretch>
+                  </pic:blipFill>
+                  <pic:spPr>
+                    <a:xfrm>
+                      <a:off x="0" y="0"/>
+                      <a:ext cx="9777730" cy="5500370"/>
+                    </a:xfrm>
+                    <a:prstGeom prst="rect">
+                      <a:avLst/>
+                    </a:prstGeom>
+                  </pic:spPr>
+                </pic:pic>
+              </a:graphicData>
+            </a:graphic>
+          </wp:anchor>
+        </w:drawing>
+      </w:r>
+      <w:r>
+        <w:rPr>
+          <w:b/>
+          <w:bCs/>
+        </w:rPr>
+        <w:t>Deleting Vehicles</w:t>
+      </w:r>
+      <w:r>
+        <w:rPr>
+          <w:b/>
+          <w:bCs/>
+        </w:rPr>
+        <w:t xml:space="preserve">: This </w:t>
+      </w:r>
+      <w:proofErr w:type="gramStart"/>
+      <w:r>
+        <w:rPr>
+          <w:b/>
+          <w:bCs/>
+        </w:rPr>
+        <w:t>is shows</w:t>
+      </w:r>
+      <w:proofErr w:type="gramEnd"/>
+      <w:r>
+        <w:rPr>
+          <w:b/>
+          <w:bCs/>
+        </w:rPr>
+        <w:t xml:space="preserve"> that it is deleting the vehicle from table and showing success. </w:t>
+      </w:r>
+      <w:r>
+        <w:rPr>
+          <w:b/>
+          <w:bCs/>
+        </w:rPr>
+        <w:br/>
+      </w:r>
+    </w:p>
+    <w:p/>
+    <w:p>
+      <w:pPr>
+        <w:pStyle w:val="Heading2"/>
+        <w:numPr>
+          <w:ilvl w:val="0"/>
+          <w:numId w:val="7"/>
+        </w:numPr>
+        <w:rPr>
+          <w:b/>
+          <w:bCs/>
+        </w:rPr>
+      </w:pPr>
+      <w:r>
+        <w:rPr>
+          <w:b/>
+          <w:bCs/>
+          <w:noProof/>
+        </w:rPr>
+        <w:lastRenderedPageBreak/>
+        <w:drawing>
+          <wp:anchor distT="0" distB="0" distL="114300" distR="114300" simplePos="0" relativeHeight="251677696" behindDoc="0" locked="0" layoutInCell="1" allowOverlap="1" wp14:anchorId="13BE4C34" wp14:editId="14FD10C6">
+            <wp:simplePos x="0" y="0"/>
+            <wp:positionH relativeFrom="column">
+              <wp:posOffset>85725</wp:posOffset>
+            </wp:positionH>
+            <wp:positionV relativeFrom="paragraph">
+              <wp:posOffset>495300</wp:posOffset>
+            </wp:positionV>
+            <wp:extent cx="9777730" cy="5497830"/>
+            <wp:effectExtent l="0" t="0" r="0" b="7620"/>
+            <wp:wrapSquare wrapText="bothSides"/>
+            <wp:docPr id="1974853776" name="Picture 1"/>
+            <wp:cNvGraphicFramePr>
+              <a:graphicFrameLocks xmlns:a="http://schemas.openxmlformats.org/drawingml/2006/main" noChangeAspect="1"/>
+            </wp:cNvGraphicFramePr>
+            <a:graphic xmlns:a="http://schemas.openxmlformats.org/drawingml/2006/main">
+              <a:graphicData uri="http://schemas.openxmlformats.org/drawingml/2006/picture">
+                <pic:pic xmlns:pic="http://schemas.openxmlformats.org/drawingml/2006/picture">
+                  <pic:nvPicPr>
+                    <pic:cNvPr id="1974853776" name=""/>
+                    <pic:cNvPicPr/>
+                  </pic:nvPicPr>
+                  <pic:blipFill>
+                    <a:blip r:embed="rId32">
+                      <a:extLst>
+                        <a:ext uri="{28A0092B-C50C-407E-A947-70E740481C1C}">
+                          <a14:useLocalDpi xmlns:a14="http://schemas.microsoft.com/office/drawing/2010/main" val="0"/>
+                        </a:ext>
+                      </a:extLst>
+                    </a:blip>
+                    <a:stretch>
+                      <a:fillRect/>
+                    </a:stretch>
+                  </pic:blipFill>
+                  <pic:spPr>
+                    <a:xfrm>
+                      <a:off x="0" y="0"/>
+                      <a:ext cx="9777730" cy="5497830"/>
+                    </a:xfrm>
+                    <a:prstGeom prst="rect">
+                      <a:avLst/>
+                    </a:prstGeom>
+                  </pic:spPr>
+                </pic:pic>
+              </a:graphicData>
+            </a:graphic>
+          </wp:anchor>
+        </w:drawing>
+      </w:r>
+      <w:r>
+        <w:rPr>
+          <w:b/>
+          <w:bCs/>
+        </w:rPr>
+        <w:t>Updating the status: Updating the status of Vehicle From “</w:t>
+      </w:r>
+      <w:proofErr w:type="gramStart"/>
+      <w:r>
+        <w:rPr>
+          <w:b/>
+          <w:bCs/>
+        </w:rPr>
+        <w:t>Available ”</w:t>
+      </w:r>
+      <w:proofErr w:type="gramEnd"/>
+      <w:r>
+        <w:rPr>
+          <w:b/>
+          <w:bCs/>
+        </w:rPr>
+        <w:t xml:space="preserve"> to “Reserved” and </w:t>
+      </w:r>
+      <w:r>
+        <w:rPr>
+          <w:b/>
+          <w:bCs/>
+        </w:rPr>
+        <w:t xml:space="preserve">returns </w:t>
+      </w:r>
+      <w:r>
+        <w:rPr>
+          <w:b/>
+          <w:bCs/>
+        </w:rPr>
+        <w:t xml:space="preserve">200 </w:t>
+      </w:r>
+      <w:proofErr w:type="gramStart"/>
+      <w:r>
+        <w:rPr>
+          <w:b/>
+          <w:bCs/>
+        </w:rPr>
+        <w:t>ok</w:t>
+      </w:r>
+      <w:proofErr w:type="gramEnd"/>
+      <w:r>
+        <w:rPr>
+          <w:b/>
+          <w:bCs/>
+        </w:rPr>
+        <w:t xml:space="preserve"> </w:t>
+      </w:r>
+      <w:r>
+        <w:rPr>
+          <w:b/>
+          <w:bCs/>
+        </w:rPr>
+        <w:br/>
+      </w:r>
+    </w:p>
+    <w:p/>
+    <w:p>
+      <w:pPr>
+        <w:pStyle w:val="Heading2"/>
+        <w:numPr>
+          <w:ilvl w:val="0"/>
+          <w:numId w:val="7"/>
+        </w:numPr>
+        <w:rPr>
+          <w:b/>
+          <w:bCs/>
+        </w:rPr>
+      </w:pPr>
+      <w:r>
+        <w:rPr>
+          <w:b/>
+          <w:bCs/>
+          <w:noProof/>
         </w:rPr>
         <w:lastRenderedPageBreak/>
         <w:drawing>
@@ -2847,7 +2946,7 @@
                     <pic:cNvPicPr/>
                   </pic:nvPicPr>
                   <pic:blipFill>
-                    <a:blip r:embed="rId31">
+                    <a:blip r:embed="rId33">
                       <a:extLst>
                         <a:ext uri="{28A0092B-C50C-407E-A947-70E740481C1C}">
                           <a14:useLocalDpi xmlns:a14="http://schemas.microsoft.com/office/drawing/2010/main" val="0"/>
@@ -4264,6 +4363,7 @@
   <w:style w:type="character" w:default="1" w:styleId="DefaultParagraphFont">
     <w:name w:val="Default Paragraph Font"/>
     <w:uiPriority w:val="1"/>
+    <w:semiHidden/>
     <w:unhideWhenUsed/>
   </w:style>
   <w:style w:type="table" w:default="1" w:styleId="TableNormal">

</xml_diff>